<commit_message>
Segunda revisión de cierre: pausa sin trabajo, posición del sensor y documentación
- Pausar sin trabajo abierto (web o botonera) deja el telar apagado, no pausado.
- Reporte del sensor: repeticion_en_fila solo válida junto a una fila válida y dentro de sus repeticiones.
- Terminar trabajo, retroceder y cerrar sesión marcan la generación (no se vuelve a sumar al tejido).
- Documentos: código de recuperación fijo y cifrado, fuente en plaqueta aparte, capacitores de 100 nF,
  rutas de la API que faltaban en el README.

Co-Authored-By: Claude Opus 5.5 <noreply@anthropic.com>
Claude-Session: https://claude.ai/code/session_01QiY8ZZNAM9gwPKiqSkCaaj
</commit_message>
<xml_diff>
--- a/documentacion_proyecto/Guia_Armado_Bloque_A.docx
+++ b/documentacion_proyecto/Guia_Armado_Bloque_A.docx
@@ -159,7 +159,7 @@
           <w:i w:val="false"/>
           <w:iCs w:val="false"/>
         </w:rPr>
-        <w:t xml:space="preserve">Es la parte más crítica de todo el bloque: el módulo HLK-5M05 toma 220 V de la red de la planta (no del telar) y entrega 5 V aislados. Todo se conecta con el cable desenchufado, y la primera vez se prueba con alguien que sepa de instalaciones eléctricas presente.</w:t>
+        <w:t xml:space="preserve">Es la parte más crítica de todo el bloque: el módulo HLK-5M05 toma 220 V de la red de la planta (no del telar) y entrega 5 V aislados. Todo se conecta con el cable desenchufado, y la primera vez se prueba con alguien que sepa de instalaciones eléctricas presente. En el armado definitivo el HLK-5M05 va soldado en una plaqueta chica aparte, con una bornera de 220 V de entrada y una de 5 V de salida: lo que lleva tensión de red queda separado de la placa del ESP32 y del sensado.</w:t>
       </w:r>
     </w:p>
     <w:p>
@@ -598,7 +598,7 @@
         <w:spacing w:after="100"/>
       </w:pPr>
       <w:r>
-        <w:t xml:space="preserve">Los otros 2 capacitores cerámicos 100nF: uno cerca del pin de alimentación del ESP32 y otro cerca del módulo de relés, como desacople local para reducir ruido que pueda resetear el ESP32.</w:t>
+        <w:t xml:space="preserve">Los 3 capacitores cerámicos de 100 nF: uno cerca del pin de alimentación del ESP32 y uno cerca de la alimentación de cada módulo de relé (el de 2 canales y el de Retroceder), como desacople local para reducir el ruido que puede resetear el ESP32.</w:t>
       </w:r>
     </w:p>
     <w:p>

</xml_diff>